<commit_message>
Internal model design su matlab
</commit_message>
<xml_diff>
--- a/tesi/traccia-tesi-bozza.docx
+++ b/tesi/traccia-tesi-bozza.docx
@@ -87,7 +87,15 @@
         <w:t xml:space="preserve"> secondi, utilizzando il metodo</w:t>
       </w:r>
       <w:r>
-        <w:t xml:space="preserve"> di integrazione</w:t>
+        <w:t xml:space="preserve"> </w:t>
+      </w:r>
+      <w:proofErr w:type="spellStart"/>
+      <w:r>
+        <w:t>di</w:t>
+      </w:r>
+      <w:proofErr w:type="spellEnd"/>
+      <w:r>
+        <w:t xml:space="preserve"> integrazione</w:t>
       </w:r>
       <w:r>
         <w:t xml:space="preserve"> RK-4. Il pendolo è rappresentato da un carrello di massa </w:t>
@@ -221,7 +229,21 @@
         <w:rPr>
           <w:rFonts w:eastAsiaTheme="minorEastAsia"/>
         </w:rPr>
-        <w:t xml:space="preserve"> viene calcolato ogni 5 passi di simulazione, e tenuto costante per i restanti</w:t>
+        <w:t xml:space="preserve"> viene calcolato ogni </w:t>
+      </w:r>
+      <w:proofErr w:type="gramStart"/>
+      <w:r>
+        <w:rPr>
+          <w:rFonts w:eastAsiaTheme="minorEastAsia"/>
+        </w:rPr>
+        <w:t>5</w:t>
+      </w:r>
+      <w:proofErr w:type="gramEnd"/>
+      <w:r>
+        <w:rPr>
+          <w:rFonts w:eastAsiaTheme="minorEastAsia"/>
+        </w:rPr>
+        <w:t xml:space="preserve"> passi di simulazione, e tenuto costante per i restanti</w:t>
       </w:r>
       <w:r>
         <w:rPr>
@@ -408,11 +430,19 @@
         </w:rPr>
         <w:t xml:space="preserve">agenti su variabili separate: uno per stabilizzare l’angolo e l’altro per stabilizzare il carrello. </w:t>
       </w:r>
-      <w:r>
-        <w:rPr>
-          <w:rFonts w:eastAsiaTheme="minorEastAsia"/>
-        </w:rPr>
-        <w:t xml:space="preserve">E’ inoltre stato aggiunto un segnale di riferimento </w:t>
+      <w:proofErr w:type="gramStart"/>
+      <w:r>
+        <w:rPr>
+          <w:rFonts w:eastAsiaTheme="minorEastAsia"/>
+        </w:rPr>
+        <w:t>E’</w:t>
+      </w:r>
+      <w:proofErr w:type="gramEnd"/>
+      <w:r>
+        <w:rPr>
+          <w:rFonts w:eastAsiaTheme="minorEastAsia"/>
+        </w:rPr>
+        <w:t xml:space="preserve"> inoltre stato aggiunto un segnale di riferimento </w:t>
       </w:r>
       <m:oMath>
         <m:sSub>
@@ -454,11 +484,19 @@
         </w:rPr>
         <w:t xml:space="preserve"> per effettuare il tracking sulla posizione del carrello. </w:t>
       </w:r>
-      <w:r>
-        <w:rPr>
-          <w:rFonts w:eastAsiaTheme="minorEastAsia"/>
-        </w:rPr>
-        <w:t>E’ stato scelto come</w:t>
+      <w:proofErr w:type="gramStart"/>
+      <w:r>
+        <w:rPr>
+          <w:rFonts w:eastAsiaTheme="minorEastAsia"/>
+        </w:rPr>
+        <w:t>E’</w:t>
+      </w:r>
+      <w:proofErr w:type="gramEnd"/>
+      <w:r>
+        <w:rPr>
+          <w:rFonts w:eastAsiaTheme="minorEastAsia"/>
+        </w:rPr>
+        <w:t xml:space="preserve"> stato scelto come</w:t>
       </w:r>
       <w:r>
         <w:rPr>
@@ -1145,6 +1183,7 @@
         </w:rPr>
         <w:t xml:space="preserve"> </w:t>
       </w:r>
+      <w:proofErr w:type="spellStart"/>
       <w:r>
         <w:rPr>
           <w:rFonts w:eastAsiaTheme="minorEastAsia"/>
@@ -1153,6 +1192,7 @@
         </w:rPr>
         <w:t>train</w:t>
       </w:r>
+      <w:proofErr w:type="spellEnd"/>
       <w:r>
         <w:rPr>
           <w:rFonts w:eastAsiaTheme="minorEastAsia"/>
@@ -1494,7 +1534,21 @@
         <w:rPr>
           <w:rFonts w:eastAsiaTheme="minorEastAsia"/>
         </w:rPr>
-        <w:t xml:space="preserve"> di train e test:</w:t>
+        <w:t xml:space="preserve"> di </w:t>
+      </w:r>
+      <w:proofErr w:type="spellStart"/>
+      <w:r>
+        <w:rPr>
+          <w:rFonts w:eastAsiaTheme="minorEastAsia"/>
+        </w:rPr>
+        <w:t>train</w:t>
+      </w:r>
+      <w:proofErr w:type="spellEnd"/>
+      <w:r>
+        <w:rPr>
+          <w:rFonts w:eastAsiaTheme="minorEastAsia"/>
+        </w:rPr>
+        <w:t xml:space="preserve"> e test:</w:t>
       </w:r>
     </w:p>
     <w:p>
@@ -1513,7 +1567,21 @@
         <w:rPr>
           <w:rFonts w:eastAsiaTheme="minorEastAsia"/>
         </w:rPr>
-        <w:t xml:space="preserve"> on train dataset:</w:t>
+        <w:t xml:space="preserve"> on </w:t>
+      </w:r>
+      <w:proofErr w:type="spellStart"/>
+      <w:r>
+        <w:rPr>
+          <w:rFonts w:eastAsiaTheme="minorEastAsia"/>
+        </w:rPr>
+        <w:t>train</w:t>
+      </w:r>
+      <w:proofErr w:type="spellEnd"/>
+      <w:r>
+        <w:rPr>
+          <w:rFonts w:eastAsiaTheme="minorEastAsia"/>
+        </w:rPr>
+        <w:t xml:space="preserve"> dataset:</w:t>
       </w:r>
       <w:r>
         <w:rPr>
@@ -1778,7 +1846,21 @@
         <w:rPr>
           <w:rFonts w:eastAsiaTheme="minorEastAsia"/>
         </w:rPr>
-        <w:t xml:space="preserve">per tutte e 4 le variabili di stato. E’ graficato per il </w:t>
+        <w:t xml:space="preserve">per tutte e 4 le variabili di stato. </w:t>
+      </w:r>
+      <w:proofErr w:type="gramStart"/>
+      <w:r>
+        <w:rPr>
+          <w:rFonts w:eastAsiaTheme="minorEastAsia"/>
+        </w:rPr>
+        <w:t>E’</w:t>
+      </w:r>
+      <w:proofErr w:type="gramEnd"/>
+      <w:r>
+        <w:rPr>
+          <w:rFonts w:eastAsiaTheme="minorEastAsia"/>
+        </w:rPr>
+        <w:t xml:space="preserve"> graficato per il </w:t>
       </w:r>
       <w:r>
         <w:rPr>
@@ -1786,6 +1868,7 @@
         </w:rPr>
         <w:t xml:space="preserve">dataset di </w:t>
       </w:r>
+      <w:proofErr w:type="spellStart"/>
       <w:r>
         <w:rPr>
           <w:rFonts w:eastAsiaTheme="minorEastAsia"/>
@@ -1794,6 +1877,7 @@
         </w:rPr>
         <w:t>train</w:t>
       </w:r>
+      <w:proofErr w:type="spellEnd"/>
       <w:r>
         <w:rPr>
           <w:rFonts w:eastAsiaTheme="minorEastAsia"/>
@@ -1813,6 +1897,27 @@
           <w:rFonts w:eastAsiaTheme="minorEastAsia"/>
         </w:rPr>
         <w:t>.</w:t>
+      </w:r>
+    </w:p>
+    <w:p>
+      <w:pPr>
+        <w:rPr>
+          <w:rFonts w:eastAsiaTheme="minorEastAsia"/>
+        </w:rPr>
+      </w:pPr>
+      <w:r>
+        <w:rPr>
+          <w:rFonts w:eastAsiaTheme="minorEastAsia"/>
+          <w:highlight w:val="green"/>
+        </w:rPr>
+        <w:lastRenderedPageBreak/>
+        <w:t>SEPARA PLOT ERRORE E VARIABILE, E MOSTRA SOLO THETA E X</w:t>
+      </w:r>
+      <w:r>
+        <w:rPr>
+          <w:rFonts w:eastAsiaTheme="minorEastAsia"/>
+        </w:rPr>
+        <w:t xml:space="preserve"> </w:t>
       </w:r>
     </w:p>
     <w:p>
@@ -1829,7 +1934,6 @@
           <w:sz w:val="32"/>
           <w:szCs w:val="32"/>
         </w:rPr>
-        <w:lastRenderedPageBreak/>
         <w:t>Controllo con state-feedback e LQR</w:t>
       </w:r>
     </w:p>
@@ -1900,11 +2004,19 @@
           <w:rFonts w:eastAsiaTheme="minorEastAsia"/>
         </w:rPr>
       </w:pPr>
-      <w:r>
-        <w:rPr>
-          <w:rFonts w:eastAsiaTheme="minorEastAsia"/>
-        </w:rPr>
-        <w:t>E’ stata anche graficata la differenza (errore)</w:t>
+      <w:proofErr w:type="gramStart"/>
+      <w:r>
+        <w:rPr>
+          <w:rFonts w:eastAsiaTheme="minorEastAsia"/>
+        </w:rPr>
+        <w:t>E’</w:t>
+      </w:r>
+      <w:proofErr w:type="gramEnd"/>
+      <w:r>
+        <w:rPr>
+          <w:rFonts w:eastAsiaTheme="minorEastAsia"/>
+        </w:rPr>
+        <w:t xml:space="preserve"> stata anche graficata la differenza (errore)</w:t>
       </w:r>
       <w:r>
         <w:rPr>
@@ -2056,6 +2168,7 @@
         <w:rPr>
           <w:rFonts w:eastAsiaTheme="minorEastAsia"/>
         </w:rPr>
+        <w:lastRenderedPageBreak/>
         <w:t>Fig.8</w:t>
       </w:r>
     </w:p>
@@ -2070,7 +2183,6 @@
         <w:rPr>
           <w:noProof/>
         </w:rPr>
-        <w:lastRenderedPageBreak/>
         <w:drawing>
           <wp:inline distT="0" distB="0" distL="0" distR="0" wp14:anchorId="58EEECF1" wp14:editId="6F184999">
             <wp:extent cx="6120130" cy="3318510"/>
@@ -2136,11 +2248,47 @@
         </w:rPr>
         <w:t xml:space="preserve">CONCLUSIONE: </w:t>
       </w:r>
-      <w:r>
-        <w:rPr>
-          <w:rFonts w:eastAsiaTheme="minorEastAsia"/>
-        </w:rPr>
-        <w:t xml:space="preserve">E’ stato possibile identificare il sistema tramite regressione lineare e utilizzare le matrici A, B ottenute per progettare un gain K capace di stabilizzare il sistema non lineare. </w:t>
+      <w:proofErr w:type="gramStart"/>
+      <w:r>
+        <w:rPr>
+          <w:rFonts w:eastAsiaTheme="minorEastAsia"/>
+        </w:rPr>
+        <w:t>E’</w:t>
+      </w:r>
+      <w:proofErr w:type="gramEnd"/>
+      <w:r>
+        <w:rPr>
+          <w:rFonts w:eastAsiaTheme="minorEastAsia"/>
+        </w:rPr>
+        <w:t xml:space="preserve"> stato possibile identificare il sistema tramite regressione lineare e utilizzare le matrici A, B ottenute per progettare un gain K capace di stabilizzare il sistema non lineare. </w:t>
+      </w:r>
+    </w:p>
+    <w:p>
+      <w:pPr>
+        <w:rPr>
+          <w:rFonts w:eastAsiaTheme="minorEastAsia"/>
+        </w:rPr>
+      </w:pPr>
+      <w:r>
+        <w:rPr>
+          <w:rFonts w:eastAsiaTheme="minorEastAsia"/>
+          <w:highlight w:val="green"/>
+        </w:rPr>
+        <w:t>AGGIUNGI GRAFICO DI PENDOLO FUORI LA STABILITA</w:t>
+      </w:r>
+    </w:p>
+    <w:p>
+      <w:pPr>
+        <w:rPr>
+          <w:rFonts w:eastAsiaTheme="minorEastAsia"/>
+        </w:rPr>
+      </w:pPr>
+      <w:r>
+        <w:rPr>
+          <w:rFonts w:eastAsiaTheme="minorEastAsia"/>
+          <w:highlight w:val="green"/>
+        </w:rPr>
+        <w:t>INVECE DI FARE IL GRAIFCO DELL’ERRPRE MOSTRA SOLO PARAMETRI COME DEVIAZIONE MASSIMA</w:t>
       </w:r>
     </w:p>
     <w:p>
@@ -2229,7 +2377,21 @@
         <w:rPr>
           <w:rFonts w:eastAsiaTheme="minorEastAsia"/>
         </w:rPr>
-        <w:t xml:space="preserve">e deviazione standard 10^-4. Vengono ricondotte le simulazioni come in precedenza, una per il train [Fig.10] e una per il test. </w:t>
+        <w:t xml:space="preserve">e deviazione standard 10^-4. Vengono ricondotte le simulazioni come in precedenza, una per il </w:t>
+      </w:r>
+      <w:proofErr w:type="spellStart"/>
+      <w:r>
+        <w:rPr>
+          <w:rFonts w:eastAsiaTheme="minorEastAsia"/>
+        </w:rPr>
+        <w:t>train</w:t>
+      </w:r>
+      <w:proofErr w:type="spellEnd"/>
+      <w:r>
+        <w:rPr>
+          <w:rFonts w:eastAsiaTheme="minorEastAsia"/>
+        </w:rPr>
+        <w:t xml:space="preserve"> [Fig.10] e una per il test. </w:t>
       </w:r>
     </w:p>
     <w:p>
@@ -2244,6 +2406,7 @@
         <w:rPr>
           <w:noProof/>
         </w:rPr>
+        <w:lastRenderedPageBreak/>
         <w:drawing>
           <wp:inline distT="0" distB="0" distL="0" distR="0" wp14:anchorId="16CC0594" wp14:editId="5613943F">
             <wp:extent cx="6120130" cy="3249930"/>
@@ -2309,7 +2472,6 @@
         <w:rPr>
           <w:rFonts w:eastAsiaTheme="minorEastAsia"/>
         </w:rPr>
-        <w:lastRenderedPageBreak/>
         <w:t>La regressione su questo dataset produce</w:t>
       </w:r>
     </w:p>
@@ -2348,6 +2510,7 @@
         </w:rPr>
         <w:t xml:space="preserve"> sul dataset di </w:t>
       </w:r>
+      <w:proofErr w:type="spellStart"/>
       <w:r>
         <w:rPr>
           <w:rFonts w:eastAsiaTheme="minorEastAsia"/>
@@ -2356,6 +2519,7 @@
         </w:rPr>
         <w:t>train</w:t>
       </w:r>
+      <w:proofErr w:type="spellEnd"/>
     </w:p>
     <w:p>
       <w:pPr>
@@ -2503,6 +2667,19 @@
         </w:rPr>
         <w:t>: l’identificazione peggiora con l’aggiunta di rumore ma è comunque sufficiente per progettare un gain K capace di stabilizzare il sistema a ciclo chiuso.</w:t>
       </w:r>
+      <w:r>
+        <w:rPr>
+          <w:rFonts w:eastAsiaTheme="minorEastAsia"/>
+        </w:rPr>
+        <w:t xml:space="preserve"> </w:t>
+      </w:r>
+      <w:r>
+        <w:rPr>
+          <w:rFonts w:eastAsiaTheme="minorEastAsia"/>
+          <w:highlight w:val="green"/>
+        </w:rPr>
+        <w:t>GRAFICO COME L’ALTRO</w:t>
+      </w:r>
     </w:p>
     <w:p>
       <w:pPr>
@@ -2587,6 +2764,13 @@
           <w:rFonts w:eastAsiaTheme="minorEastAsia"/>
         </w:rPr>
       </w:pPr>
+      <w:r>
+        <w:rPr>
+          <w:rFonts w:eastAsiaTheme="minorEastAsia"/>
+          <w:highlight w:val="green"/>
+        </w:rPr>
+        <w:t>INTERNAL MODEL DESIGN</w:t>
+      </w:r>
     </w:p>
     <w:p>
       <w:pPr>
@@ -2620,7 +2804,6 @@
           <w:sz w:val="28"/>
           <w:szCs w:val="28"/>
         </w:rPr>
-        <w:lastRenderedPageBreak/>
         <w:t>Aggiunta di perdite di pacchetti nel canale</w:t>
       </w:r>
     </w:p>
@@ -2682,11 +2865,19 @@
           <w:rFonts w:eastAsiaTheme="minorEastAsia"/>
         </w:rPr>
       </w:pPr>
-      <w:r>
-        <w:rPr>
-          <w:rFonts w:eastAsiaTheme="minorEastAsia"/>
-        </w:rPr>
-        <w:t xml:space="preserve">E’ introdotto un parametro </w:t>
+      <w:proofErr w:type="gramStart"/>
+      <w:r>
+        <w:rPr>
+          <w:rFonts w:eastAsiaTheme="minorEastAsia"/>
+        </w:rPr>
+        <w:t>E’</w:t>
+      </w:r>
+      <w:proofErr w:type="gramEnd"/>
+      <w:r>
+        <w:rPr>
+          <w:rFonts w:eastAsiaTheme="minorEastAsia"/>
+        </w:rPr>
+        <w:t xml:space="preserve"> introdotto un parametro </w:t>
       </w:r>
       <w:r>
         <w:rPr>
@@ -2949,6 +3140,47 @@
           </m:sup>
         </m:sSup>
       </m:oMath>
+      <w:r>
+        <w:rPr>
+          <w:rFonts w:eastAsiaTheme="minorEastAsia"/>
+          <w:sz w:val="28"/>
+          <w:szCs w:val="28"/>
+        </w:rPr>
+        <w:tab/>
+      </w:r>
+      <w:r>
+        <w:rPr>
+          <w:rFonts w:eastAsiaTheme="minorEastAsia"/>
+          <w:sz w:val="28"/>
+          <w:szCs w:val="28"/>
+        </w:rPr>
+        <w:sym w:font="Wingdings" w:char="F0DF"/>
+      </w:r>
+      <w:r>
+        <w:rPr>
+          <w:rFonts w:eastAsiaTheme="minorEastAsia"/>
+          <w:sz w:val="28"/>
+          <w:szCs w:val="28"/>
+        </w:rPr>
+        <w:t xml:space="preserve"> </w:t>
+      </w:r>
+      <w:r>
+        <w:rPr>
+          <w:rFonts w:eastAsiaTheme="minorEastAsia"/>
+          <w:sz w:val="28"/>
+          <w:szCs w:val="28"/>
+          <w:highlight w:val="green"/>
+        </w:rPr>
+        <w:t>CHIAMALO COSTO</w:t>
+      </w:r>
+      <w:r>
+        <w:rPr>
+          <w:rFonts w:eastAsiaTheme="minorEastAsia"/>
+          <w:sz w:val="28"/>
+          <w:szCs w:val="28"/>
+        </w:rPr>
+        <w:t xml:space="preserve"> (LEVA IL TEMPO SE LE SIMULAZIONI HANNO STESSA DURATA)</w:t>
+      </w:r>
     </w:p>
     <w:p>
       <w:pPr>
@@ -3507,6 +3739,7 @@
                 <w:b/>
                 <w:bCs/>
               </w:rPr>
+              <w:lastRenderedPageBreak/>
               <w:t>Probabilità di perdita (%)</w:t>
             </w:r>
           </w:p>
@@ -4079,7 +4312,6 @@
         <w:rPr>
           <w:noProof/>
         </w:rPr>
-        <w:lastRenderedPageBreak/>
         <w:drawing>
           <wp:inline distT="0" distB="0" distL="0" distR="0" wp14:anchorId="03E24654" wp14:editId="29E23938">
             <wp:extent cx="6120130" cy="3239770"/>
@@ -4141,6 +4373,7 @@
         <w:rPr>
           <w:noProof/>
         </w:rPr>
+        <w:lastRenderedPageBreak/>
         <w:drawing>
           <wp:inline distT="0" distB="0" distL="0" distR="0" wp14:anchorId="51B003EF" wp14:editId="2780B913">
             <wp:extent cx="6120130" cy="3239770"/>
@@ -4214,7 +4447,6 @@
         <w:rPr>
           <w:noProof/>
         </w:rPr>
-        <w:lastRenderedPageBreak/>
         <w:drawing>
           <wp:inline distT="0" distB="0" distL="0" distR="0" wp14:anchorId="54E28C35" wp14:editId="555D702F">
             <wp:extent cx="6120130" cy="3239770"/>
@@ -4308,6 +4540,12 @@
           <w:rFonts w:eastAsiaTheme="minorEastAsia"/>
         </w:rPr>
         <w:t>:</w:t>
+      </w:r>
+      <w:r>
+        <w:rPr>
+          <w:rFonts w:eastAsiaTheme="minorEastAsia"/>
+        </w:rPr>
+        <w:t xml:space="preserve"> </w:t>
       </w:r>
     </w:p>
     <w:p>
@@ -4633,6 +4871,7 @@
         <w:rPr>
           <w:rFonts w:eastAsiaTheme="minorEastAsia"/>
         </w:rPr>
+        <w:lastRenderedPageBreak/>
         <w:t xml:space="preserve">Valori di fitness per varie probabilità di perdita di pacchetto con policy </w:t>
       </w:r>
       <w:r>
@@ -4660,6 +4899,20 @@
           <w:rFonts w:eastAsiaTheme="minorEastAsia"/>
         </w:rPr>
         <w:t xml:space="preserve"> (stesso segnale di riferimento e condizioni iniziali):</w:t>
+      </w:r>
+    </w:p>
+    <w:p>
+      <w:pPr>
+        <w:rPr>
+          <w:rFonts w:eastAsiaTheme="minorEastAsia"/>
+        </w:rPr>
+      </w:pPr>
+      <w:r>
+        <w:rPr>
+          <w:rFonts w:eastAsiaTheme="minorEastAsia"/>
+          <w:highlight w:val="green"/>
+        </w:rPr>
+        <w:t>METTERE A CONFRONTO IL FATTORE DI DECADIMENTO SU UN GRAFICO</w:t>
       </w:r>
     </w:p>
     <w:tbl>
@@ -5326,7 +5579,6 @@
         <w:rPr>
           <w:noProof/>
         </w:rPr>
-        <w:lastRenderedPageBreak/>
         <w:drawing>
           <wp:inline distT="0" distB="0" distL="0" distR="0" wp14:anchorId="6751EE1F" wp14:editId="2E0B4873">
             <wp:extent cx="6120130" cy="3979545"/>
@@ -5389,6 +5641,7 @@
         <w:rPr>
           <w:noProof/>
         </w:rPr>
+        <w:lastRenderedPageBreak/>
         <w:drawing>
           <wp:inline distT="0" distB="0" distL="0" distR="0" wp14:anchorId="5F51B776" wp14:editId="4091BA61">
             <wp:extent cx="6120130" cy="3979545"/>
@@ -5455,7 +5708,6 @@
         <w:rPr>
           <w:noProof/>
         </w:rPr>
-        <w:lastRenderedPageBreak/>
         <w:drawing>
           <wp:inline distT="0" distB="0" distL="0" distR="0" wp14:anchorId="1E935910" wp14:editId="70C9D742">
             <wp:extent cx="6120130" cy="3979545"/>
@@ -5517,6 +5769,7 @@
         <w:rPr>
           <w:noProof/>
         </w:rPr>
+        <w:lastRenderedPageBreak/>
         <w:drawing>
           <wp:inline distT="0" distB="0" distL="0" distR="0" wp14:anchorId="08836368" wp14:editId="5324D7E1">
             <wp:extent cx="6120130" cy="3979545"/>
@@ -5593,7 +5846,6 @@
           <w:sz w:val="28"/>
           <w:szCs w:val="28"/>
         </w:rPr>
-        <w:lastRenderedPageBreak/>
         <w:t>IMPLEMENTAZIONE SU PENDOLO REALE</w:t>
       </w:r>
     </w:p>
@@ -5613,6 +5865,42 @@
         </w:rPr>
         <w:t>…</w:t>
       </w:r>
+    </w:p>
+    <w:p>
+      <w:pPr>
+        <w:rPr>
+          <w:rFonts w:eastAsiaTheme="minorEastAsia"/>
+          <w:sz w:val="28"/>
+          <w:szCs w:val="28"/>
+        </w:rPr>
+      </w:pPr>
+    </w:p>
+    <w:p>
+      <w:pPr>
+        <w:rPr>
+          <w:rFonts w:eastAsiaTheme="minorEastAsia"/>
+          <w:sz w:val="28"/>
+          <w:szCs w:val="28"/>
+        </w:rPr>
+      </w:pPr>
+    </w:p>
+    <w:p>
+      <w:pPr>
+        <w:rPr>
+          <w:rFonts w:eastAsiaTheme="minorEastAsia"/>
+          <w:sz w:val="28"/>
+          <w:szCs w:val="28"/>
+        </w:rPr>
+      </w:pPr>
+    </w:p>
+    <w:p>
+      <w:pPr>
+        <w:rPr>
+          <w:rFonts w:eastAsiaTheme="minorEastAsia"/>
+          <w:sz w:val="28"/>
+          <w:szCs w:val="28"/>
+        </w:rPr>
+      </w:pPr>
     </w:p>
     <w:sectPr>
       <w:pgSz w:w="11906" w:h="16838"/>

</xml_diff>

<commit_message>
getting ready to acquire final data
</commit_message>
<xml_diff>
--- a/tesi/traccia-tesi-bozza.docx
+++ b/tesi/traccia-tesi-bozza.docx
@@ -87,15 +87,7 @@
         <w:t xml:space="preserve"> secondi, utilizzando il metodo</w:t>
       </w:r>
       <w:r>
-        <w:t xml:space="preserve"> </w:t>
-      </w:r>
-      <w:proofErr w:type="spellStart"/>
-      <w:r>
-        <w:t>di</w:t>
-      </w:r>
-      <w:proofErr w:type="spellEnd"/>
-      <w:r>
-        <w:t xml:space="preserve"> integrazione</w:t>
+        <w:t xml:space="preserve"> di integrazione</w:t>
       </w:r>
       <w:r>
         <w:t xml:space="preserve"> RK-4. Il pendolo è rappresentato da un carrello di massa </w:t>
@@ -1114,8 +1106,18 @@
       <w:pPr>
         <w:rPr>
           <w:rFonts w:eastAsiaTheme="minorEastAsia"/>
-        </w:rPr>
-      </w:pPr>
+          <w:b/>
+          <w:bCs/>
+        </w:rPr>
+      </w:pPr>
+      <w:r>
+        <w:rPr>
+          <w:rFonts w:eastAsiaTheme="minorEastAsia"/>
+          <w:b/>
+          <w:bCs/>
+        </w:rPr>
+        <w:t>Robustezza del controllo al rumore</w:t>
+      </w:r>
     </w:p>
     <w:p>
       <w:pPr>
@@ -1929,6 +1931,19 @@
       <w:r>
         <w:rPr>
           <w:rFonts w:eastAsiaTheme="minorEastAsia"/>
+        </w:rPr>
+        <w:t xml:space="preserve">Aggiunta di rumore fino a vari livelli e valutazione solo dei RMSE (i sistemi identificati verranno ripresi dopo) </w:t>
+      </w:r>
+    </w:p>
+    <w:p>
+      <w:pPr>
+        <w:rPr>
+          <w:rFonts w:eastAsiaTheme="minorEastAsia"/>
+        </w:rPr>
+      </w:pPr>
+      <w:r>
+        <w:rPr>
+          <w:rFonts w:eastAsiaTheme="minorEastAsia"/>
           <w:b/>
           <w:bCs/>
           <w:sz w:val="32"/>
@@ -2120,6 +2135,7 @@
         <w:rPr>
           <w:noProof/>
         </w:rPr>
+        <w:lastRenderedPageBreak/>
         <w:drawing>
           <wp:inline distT="0" distB="0" distL="0" distR="0" wp14:anchorId="481E1FED" wp14:editId="29E4EB69">
             <wp:extent cx="6120130" cy="3318510"/>
@@ -2168,7 +2184,6 @@
         <w:rPr>
           <w:rFonts w:eastAsiaTheme="minorEastAsia"/>
         </w:rPr>
-        <w:lastRenderedPageBreak/>
         <w:t>Fig.8</w:t>
       </w:r>
     </w:p>
@@ -2359,6 +2374,7 @@
         <w:rPr>
           <w:rFonts w:eastAsiaTheme="minorEastAsia"/>
         </w:rPr>
+        <w:lastRenderedPageBreak/>
         <w:t xml:space="preserve">Per simulare un sistema reale, alle letture </w:t>
       </w:r>
       <w:r>
@@ -2406,7 +2422,6 @@
         <w:rPr>
           <w:noProof/>
         </w:rPr>
-        <w:lastRenderedPageBreak/>
         <w:drawing>
           <wp:inline distT="0" distB="0" distL="0" distR="0" wp14:anchorId="16CC0594" wp14:editId="5613943F">
             <wp:extent cx="6120130" cy="3249930"/>
@@ -2644,6 +2659,7 @@
           <w:sz w:val="24"/>
           <w:szCs w:val="24"/>
         </w:rPr>
+        <w:lastRenderedPageBreak/>
         <w:t>Fig.11</w:t>
       </w:r>
     </w:p>
@@ -2706,71 +2722,174 @@
       <w:pPr>
         <w:rPr>
           <w:rFonts w:eastAsiaTheme="minorEastAsia"/>
-        </w:rPr>
-      </w:pPr>
-    </w:p>
-    <w:p>
-      <w:pPr>
-        <w:rPr>
-          <w:rFonts w:eastAsiaTheme="minorEastAsia"/>
-        </w:rPr>
-      </w:pPr>
-    </w:p>
-    <w:p>
-      <w:pPr>
-        <w:rPr>
-          <w:rFonts w:eastAsiaTheme="minorEastAsia"/>
-        </w:rPr>
-      </w:pPr>
-    </w:p>
-    <w:p>
-      <w:pPr>
-        <w:rPr>
-          <w:rFonts w:eastAsiaTheme="minorEastAsia"/>
-        </w:rPr>
-      </w:pPr>
-    </w:p>
-    <w:p>
-      <w:pPr>
-        <w:rPr>
-          <w:rFonts w:eastAsiaTheme="minorEastAsia"/>
-        </w:rPr>
-      </w:pPr>
-    </w:p>
-    <w:p>
-      <w:pPr>
-        <w:rPr>
-          <w:rFonts w:eastAsiaTheme="minorEastAsia"/>
-        </w:rPr>
-      </w:pPr>
-    </w:p>
-    <w:p>
-      <w:pPr>
-        <w:rPr>
-          <w:rFonts w:eastAsiaTheme="minorEastAsia"/>
-        </w:rPr>
-      </w:pPr>
-    </w:p>
-    <w:p>
-      <w:pPr>
-        <w:rPr>
-          <w:rFonts w:eastAsiaTheme="minorEastAsia"/>
-        </w:rPr>
-      </w:pPr>
-    </w:p>
-    <w:p>
-      <w:pPr>
-        <w:rPr>
-          <w:rFonts w:eastAsiaTheme="minorEastAsia"/>
-        </w:rPr>
-      </w:pPr>
-      <w:r>
-        <w:rPr>
-          <w:rFonts w:eastAsiaTheme="minorEastAsia"/>
+          <w:b/>
+          <w:bCs/>
+          <w:sz w:val="28"/>
+          <w:szCs w:val="28"/>
+        </w:rPr>
+      </w:pPr>
+      <w:r>
+        <w:rPr>
+          <w:rFonts w:eastAsiaTheme="minorEastAsia"/>
+          <w:b/>
+          <w:bCs/>
+          <w:sz w:val="28"/>
+          <w:szCs w:val="28"/>
           <w:highlight w:val="green"/>
         </w:rPr>
         <w:t>INTERNAL MODEL DESIGN</w:t>
       </w:r>
+      <w:r>
+        <w:rPr>
+          <w:rFonts w:eastAsiaTheme="minorEastAsia"/>
+          <w:b/>
+          <w:bCs/>
+          <w:sz w:val="28"/>
+          <w:szCs w:val="28"/>
+        </w:rPr>
+        <w:t xml:space="preserve"> per un gradino</w:t>
+      </w:r>
+    </w:p>
+    <w:p>
+      <w:pPr>
+        <w:rPr>
+          <w:rFonts w:eastAsiaTheme="minorEastAsia"/>
+        </w:rPr>
+      </w:pPr>
+      <w:r>
+        <w:rPr>
+          <w:noProof/>
+        </w:rPr>
+        <w:drawing>
+          <wp:inline distT="0" distB="0" distL="0" distR="0" wp14:anchorId="5E6A68FF" wp14:editId="64FA04CA">
+            <wp:extent cx="6120130" cy="3258185"/>
+            <wp:effectExtent l="0" t="0" r="0" b="0"/>
+            <wp:docPr id="1893845657" name="Immagine 1" descr="Immagine che contiene testo, diagramma, linea, Diagramma&#10;&#10;Il contenuto generato dall'IA potrebbe non essere corretto."/>
+            <wp:cNvGraphicFramePr>
+              <a:graphicFrameLocks xmlns:a="http://schemas.openxmlformats.org/drawingml/2006/main" noChangeAspect="1"/>
+            </wp:cNvGraphicFramePr>
+            <a:graphic xmlns:a="http://schemas.openxmlformats.org/drawingml/2006/main">
+              <a:graphicData uri="http://schemas.openxmlformats.org/drawingml/2006/picture">
+                <pic:pic xmlns:pic="http://schemas.openxmlformats.org/drawingml/2006/picture">
+                  <pic:nvPicPr>
+                    <pic:cNvPr id="1893845657" name="Immagine 1" descr="Immagine che contiene testo, diagramma, linea, Diagramma&#10;&#10;Il contenuto generato dall'IA potrebbe non essere corretto."/>
+                    <pic:cNvPicPr/>
+                  </pic:nvPicPr>
+                  <pic:blipFill>
+                    <a:blip r:embed="rId19"/>
+                    <a:stretch>
+                      <a:fillRect/>
+                    </a:stretch>
+                  </pic:blipFill>
+                  <pic:spPr>
+                    <a:xfrm>
+                      <a:off x="0" y="0"/>
+                      <a:ext cx="6120130" cy="3258185"/>
+                    </a:xfrm>
+                    <a:prstGeom prst="rect">
+                      <a:avLst/>
+                    </a:prstGeom>
+                  </pic:spPr>
+                </pic:pic>
+              </a:graphicData>
+            </a:graphic>
+          </wp:inline>
+        </w:drawing>
+      </w:r>
+    </w:p>
+    <w:p>
+      <w:pPr>
+        <w:rPr>
+          <w:rFonts w:eastAsiaTheme="minorEastAsia"/>
+        </w:rPr>
+      </w:pPr>
+      <w:r>
+        <w:rPr>
+          <w:rFonts w:eastAsiaTheme="minorEastAsia"/>
+        </w:rPr>
+        <w:t xml:space="preserve">Tracking con </w:t>
+      </w:r>
+      <w:proofErr w:type="spellStart"/>
+      <w:r>
+        <w:rPr>
+          <w:rFonts w:eastAsiaTheme="minorEastAsia"/>
+        </w:rPr>
+        <w:t>internal</w:t>
+      </w:r>
+      <w:proofErr w:type="spellEnd"/>
+      <w:r>
+        <w:rPr>
+          <w:rFonts w:eastAsiaTheme="minorEastAsia"/>
+        </w:rPr>
+        <w:t xml:space="preserve"> model design per un gradino LQI.</w:t>
+      </w:r>
+    </w:p>
+    <w:p>
+      <w:pPr>
+        <w:rPr>
+          <w:rFonts w:eastAsiaTheme="minorEastAsia"/>
+        </w:rPr>
+      </w:pPr>
+      <w:r>
+        <w:rPr>
+          <w:noProof/>
+        </w:rPr>
+        <w:drawing>
+          <wp:inline distT="0" distB="0" distL="0" distR="0" wp14:anchorId="65B3433D" wp14:editId="277B4E8B">
+            <wp:extent cx="6120130" cy="3239770"/>
+            <wp:effectExtent l="0" t="0" r="0" b="0"/>
+            <wp:docPr id="730375851" name="Immagine 1" descr="Immagine che contiene testo, Diagramma, diagramma, linea&#10;&#10;Il contenuto generato dall'IA potrebbe non essere corretto."/>
+            <wp:cNvGraphicFramePr>
+              <a:graphicFrameLocks xmlns:a="http://schemas.openxmlformats.org/drawingml/2006/main" noChangeAspect="1"/>
+            </wp:cNvGraphicFramePr>
+            <a:graphic xmlns:a="http://schemas.openxmlformats.org/drawingml/2006/main">
+              <a:graphicData uri="http://schemas.openxmlformats.org/drawingml/2006/picture">
+                <pic:pic xmlns:pic="http://schemas.openxmlformats.org/drawingml/2006/picture">
+                  <pic:nvPicPr>
+                    <pic:cNvPr id="730375851" name="Immagine 1" descr="Immagine che contiene testo, Diagramma, diagramma, linea&#10;&#10;Il contenuto generato dall'IA potrebbe non essere corretto."/>
+                    <pic:cNvPicPr/>
+                  </pic:nvPicPr>
+                  <pic:blipFill>
+                    <a:blip r:embed="rId20"/>
+                    <a:stretch>
+                      <a:fillRect/>
+                    </a:stretch>
+                  </pic:blipFill>
+                  <pic:spPr>
+                    <a:xfrm>
+                      <a:off x="0" y="0"/>
+                      <a:ext cx="6120130" cy="3239770"/>
+                    </a:xfrm>
+                    <a:prstGeom prst="rect">
+                      <a:avLst/>
+                    </a:prstGeom>
+                  </pic:spPr>
+                </pic:pic>
+              </a:graphicData>
+            </a:graphic>
+          </wp:inline>
+        </w:drawing>
+      </w:r>
+    </w:p>
+    <w:p>
+      <w:pPr>
+        <w:rPr>
+          <w:rFonts w:eastAsiaTheme="minorEastAsia"/>
+        </w:rPr>
+      </w:pPr>
+      <w:r>
+        <w:rPr>
+          <w:rFonts w:eastAsiaTheme="minorEastAsia"/>
+        </w:rPr>
+        <w:t>Tracking con state feedback</w:t>
+      </w:r>
+    </w:p>
+    <w:p>
+      <w:pPr>
+        <w:rPr>
+          <w:rFonts w:eastAsiaTheme="minorEastAsia"/>
+        </w:rPr>
+      </w:pPr>
     </w:p>
     <w:p>
       <w:pPr>
@@ -3739,7 +3858,6 @@
                 <w:b/>
                 <w:bCs/>
               </w:rPr>
-              <w:lastRenderedPageBreak/>
               <w:t>Probabilità di perdita (%)</w:t>
             </w:r>
           </w:p>
@@ -4312,6 +4430,7 @@
         <w:rPr>
           <w:noProof/>
         </w:rPr>
+        <w:lastRenderedPageBreak/>
         <w:drawing>
           <wp:inline distT="0" distB="0" distL="0" distR="0" wp14:anchorId="03E24654" wp14:editId="29E23938">
             <wp:extent cx="6120130" cy="3239770"/>
@@ -4328,7 +4447,7 @@
                     <pic:cNvPicPr/>
                   </pic:nvPicPr>
                   <pic:blipFill>
-                    <a:blip r:embed="rId19"/>
+                    <a:blip r:embed="rId21"/>
                     <a:stretch>
                       <a:fillRect/>
                     </a:stretch>
@@ -4373,7 +4492,6 @@
         <w:rPr>
           <w:noProof/>
         </w:rPr>
-        <w:lastRenderedPageBreak/>
         <w:drawing>
           <wp:inline distT="0" distB="0" distL="0" distR="0" wp14:anchorId="51B003EF" wp14:editId="2780B913">
             <wp:extent cx="6120130" cy="3239770"/>
@@ -4390,7 +4508,7 @@
                     <pic:cNvPicPr/>
                   </pic:nvPicPr>
                   <pic:blipFill>
-                    <a:blip r:embed="rId20"/>
+                    <a:blip r:embed="rId22"/>
                     <a:stretch>
                       <a:fillRect/>
                     </a:stretch>
@@ -4447,6 +4565,7 @@
         <w:rPr>
           <w:noProof/>
         </w:rPr>
+        <w:lastRenderedPageBreak/>
         <w:drawing>
           <wp:inline distT="0" distB="0" distL="0" distR="0" wp14:anchorId="54E28C35" wp14:editId="555D702F">
             <wp:extent cx="6120130" cy="3239770"/>
@@ -4463,7 +4582,7 @@
                     <pic:cNvPicPr/>
                   </pic:nvPicPr>
                   <pic:blipFill>
-                    <a:blip r:embed="rId21"/>
+                    <a:blip r:embed="rId23"/>
                     <a:stretch>
                       <a:fillRect/>
                     </a:stretch>
@@ -4871,7 +4990,6 @@
         <w:rPr>
           <w:rFonts w:eastAsiaTheme="minorEastAsia"/>
         </w:rPr>
-        <w:lastRenderedPageBreak/>
         <w:t xml:space="preserve">Valori di fitness per varie probabilità di perdita di pacchetto con policy </w:t>
       </w:r>
       <w:r>
@@ -5579,6 +5697,7 @@
         <w:rPr>
           <w:noProof/>
         </w:rPr>
+        <w:lastRenderedPageBreak/>
         <w:drawing>
           <wp:inline distT="0" distB="0" distL="0" distR="0" wp14:anchorId="6751EE1F" wp14:editId="2E0B4873">
             <wp:extent cx="6120130" cy="3979545"/>
@@ -5592,135 +5711,6 @@
                 <pic:pic xmlns:pic="http://schemas.openxmlformats.org/drawingml/2006/picture">
                   <pic:nvPicPr>
                     <pic:cNvPr id="1118653042" name=""/>
-                    <pic:cNvPicPr/>
-                  </pic:nvPicPr>
-                  <pic:blipFill>
-                    <a:blip r:embed="rId22"/>
-                    <a:stretch>
-                      <a:fillRect/>
-                    </a:stretch>
-                  </pic:blipFill>
-                  <pic:spPr>
-                    <a:xfrm>
-                      <a:off x="0" y="0"/>
-                      <a:ext cx="6120130" cy="3979545"/>
-                    </a:xfrm>
-                    <a:prstGeom prst="rect">
-                      <a:avLst/>
-                    </a:prstGeom>
-                  </pic:spPr>
-                </pic:pic>
-              </a:graphicData>
-            </a:graphic>
-          </wp:inline>
-        </w:drawing>
-      </w:r>
-    </w:p>
-    <w:p>
-      <w:pPr>
-        <w:jc w:val="center"/>
-        <w:rPr>
-          <w:rFonts w:eastAsiaTheme="minorEastAsia"/>
-        </w:rPr>
-      </w:pPr>
-      <w:r>
-        <w:rPr>
-          <w:rFonts w:eastAsiaTheme="minorEastAsia"/>
-        </w:rPr>
-        <w:t>Fig.15 (p = 10%)</w:t>
-      </w:r>
-    </w:p>
-    <w:p>
-      <w:pPr>
-        <w:jc w:val="center"/>
-        <w:rPr>
-          <w:rFonts w:eastAsiaTheme="minorEastAsia"/>
-        </w:rPr>
-      </w:pPr>
-      <w:r>
-        <w:rPr>
-          <w:noProof/>
-        </w:rPr>
-        <w:lastRenderedPageBreak/>
-        <w:drawing>
-          <wp:inline distT="0" distB="0" distL="0" distR="0" wp14:anchorId="5F51B776" wp14:editId="4091BA61">
-            <wp:extent cx="6120130" cy="3979545"/>
-            <wp:effectExtent l="0" t="0" r="0" b="1905"/>
-            <wp:docPr id="1561165380" name="Immagine 1"/>
-            <wp:cNvGraphicFramePr>
-              <a:graphicFrameLocks xmlns:a="http://schemas.openxmlformats.org/drawingml/2006/main" noChangeAspect="1"/>
-            </wp:cNvGraphicFramePr>
-            <a:graphic xmlns:a="http://schemas.openxmlformats.org/drawingml/2006/main">
-              <a:graphicData uri="http://schemas.openxmlformats.org/drawingml/2006/picture">
-                <pic:pic xmlns:pic="http://schemas.openxmlformats.org/drawingml/2006/picture">
-                  <pic:nvPicPr>
-                    <pic:cNvPr id="1561165380" name=""/>
-                    <pic:cNvPicPr/>
-                  </pic:nvPicPr>
-                  <pic:blipFill>
-                    <a:blip r:embed="rId23"/>
-                    <a:stretch>
-                      <a:fillRect/>
-                    </a:stretch>
-                  </pic:blipFill>
-                  <pic:spPr>
-                    <a:xfrm>
-                      <a:off x="0" y="0"/>
-                      <a:ext cx="6120130" cy="3979545"/>
-                    </a:xfrm>
-                    <a:prstGeom prst="rect">
-                      <a:avLst/>
-                    </a:prstGeom>
-                  </pic:spPr>
-                </pic:pic>
-              </a:graphicData>
-            </a:graphic>
-          </wp:inline>
-        </w:drawing>
-      </w:r>
-      <w:r>
-        <w:rPr>
-          <w:rFonts w:eastAsiaTheme="minorEastAsia"/>
-        </w:rPr>
-        <w:t xml:space="preserve"> </w:t>
-      </w:r>
-      <w:r>
-        <w:rPr>
-          <w:rFonts w:eastAsiaTheme="minorEastAsia"/>
-        </w:rPr>
-        <w:t>Fig.16 (p = 20%)</w:t>
-      </w:r>
-    </w:p>
-    <w:p>
-      <w:pPr>
-        <w:rPr>
-          <w:rFonts w:eastAsiaTheme="minorEastAsia"/>
-        </w:rPr>
-      </w:pPr>
-    </w:p>
-    <w:p>
-      <w:pPr>
-        <w:rPr>
-          <w:rFonts w:eastAsiaTheme="minorEastAsia"/>
-        </w:rPr>
-      </w:pPr>
-      <w:r>
-        <w:rPr>
-          <w:noProof/>
-        </w:rPr>
-        <w:drawing>
-          <wp:inline distT="0" distB="0" distL="0" distR="0" wp14:anchorId="1E935910" wp14:editId="70C9D742">
-            <wp:extent cx="6120130" cy="3979545"/>
-            <wp:effectExtent l="0" t="0" r="0" b="1905"/>
-            <wp:docPr id="111672507" name="Immagine 1"/>
-            <wp:cNvGraphicFramePr>
-              <a:graphicFrameLocks xmlns:a="http://schemas.openxmlformats.org/drawingml/2006/main" noChangeAspect="1"/>
-            </wp:cNvGraphicFramePr>
-            <a:graphic xmlns:a="http://schemas.openxmlformats.org/drawingml/2006/main">
-              <a:graphicData uri="http://schemas.openxmlformats.org/drawingml/2006/picture">
-                <pic:pic xmlns:pic="http://schemas.openxmlformats.org/drawingml/2006/picture">
-                  <pic:nvPicPr>
-                    <pic:cNvPr id="111672507" name="Immagine 1"/>
                     <pic:cNvPicPr/>
                   </pic:nvPicPr>
                   <pic:blipFill>
@@ -5756,11 +5746,12 @@
         <w:rPr>
           <w:rFonts w:eastAsiaTheme="minorEastAsia"/>
         </w:rPr>
-        <w:t>Fig.17 (p = 30%)</w:t>
-      </w:r>
-    </w:p>
-    <w:p>
-      <w:pPr>
+        <w:t>Fig.15 (p = 10%)</w:t>
+      </w:r>
+    </w:p>
+    <w:p>
+      <w:pPr>
+        <w:jc w:val="center"/>
         <w:rPr>
           <w:rFonts w:eastAsiaTheme="minorEastAsia"/>
         </w:rPr>
@@ -5769,12 +5760,11 @@
         <w:rPr>
           <w:noProof/>
         </w:rPr>
-        <w:lastRenderedPageBreak/>
         <w:drawing>
-          <wp:inline distT="0" distB="0" distL="0" distR="0" wp14:anchorId="08836368" wp14:editId="5324D7E1">
+          <wp:inline distT="0" distB="0" distL="0" distR="0" wp14:anchorId="5F51B776" wp14:editId="4091BA61">
             <wp:extent cx="6120130" cy="3979545"/>
             <wp:effectExtent l="0" t="0" r="0" b="1905"/>
-            <wp:docPr id="700592080" name="Immagine 1" descr="Immagine che contiene testo, Diagramma, diagramma, linea&#10;&#10;Il contenuto generato dall'IA potrebbe non essere corretto."/>
+            <wp:docPr id="1561165380" name="Immagine 1"/>
             <wp:cNvGraphicFramePr>
               <a:graphicFrameLocks xmlns:a="http://schemas.openxmlformats.org/drawingml/2006/main" noChangeAspect="1"/>
             </wp:cNvGraphicFramePr>
@@ -5782,7 +5772,7 @@
               <a:graphicData uri="http://schemas.openxmlformats.org/drawingml/2006/picture">
                 <pic:pic xmlns:pic="http://schemas.openxmlformats.org/drawingml/2006/picture">
                   <pic:nvPicPr>
-                    <pic:cNvPr id="700592080" name="Immagine 1" descr="Immagine che contiene testo, Diagramma, diagramma, linea&#10;&#10;Il contenuto generato dall'IA potrebbe non essere corretto."/>
+                    <pic:cNvPr id="1561165380" name=""/>
                     <pic:cNvPicPr/>
                   </pic:nvPicPr>
                   <pic:blipFill>
@@ -5806,6 +5796,134 @@
           </wp:inline>
         </w:drawing>
       </w:r>
+      <w:r>
+        <w:rPr>
+          <w:rFonts w:eastAsiaTheme="minorEastAsia"/>
+        </w:rPr>
+        <w:t xml:space="preserve"> </w:t>
+      </w:r>
+      <w:r>
+        <w:rPr>
+          <w:rFonts w:eastAsiaTheme="minorEastAsia"/>
+        </w:rPr>
+        <w:t>Fig.16 (p = 20%)</w:t>
+      </w:r>
+    </w:p>
+    <w:p>
+      <w:pPr>
+        <w:rPr>
+          <w:rFonts w:eastAsiaTheme="minorEastAsia"/>
+        </w:rPr>
+      </w:pPr>
+    </w:p>
+    <w:p>
+      <w:pPr>
+        <w:rPr>
+          <w:rFonts w:eastAsiaTheme="minorEastAsia"/>
+        </w:rPr>
+      </w:pPr>
+      <w:r>
+        <w:rPr>
+          <w:noProof/>
+        </w:rPr>
+        <w:lastRenderedPageBreak/>
+        <w:drawing>
+          <wp:inline distT="0" distB="0" distL="0" distR="0" wp14:anchorId="1E935910" wp14:editId="70C9D742">
+            <wp:extent cx="6120130" cy="3979545"/>
+            <wp:effectExtent l="0" t="0" r="0" b="1905"/>
+            <wp:docPr id="111672507" name="Immagine 1"/>
+            <wp:cNvGraphicFramePr>
+              <a:graphicFrameLocks xmlns:a="http://schemas.openxmlformats.org/drawingml/2006/main" noChangeAspect="1"/>
+            </wp:cNvGraphicFramePr>
+            <a:graphic xmlns:a="http://schemas.openxmlformats.org/drawingml/2006/main">
+              <a:graphicData uri="http://schemas.openxmlformats.org/drawingml/2006/picture">
+                <pic:pic xmlns:pic="http://schemas.openxmlformats.org/drawingml/2006/picture">
+                  <pic:nvPicPr>
+                    <pic:cNvPr id="111672507" name="Immagine 1"/>
+                    <pic:cNvPicPr/>
+                  </pic:nvPicPr>
+                  <pic:blipFill>
+                    <a:blip r:embed="rId26"/>
+                    <a:stretch>
+                      <a:fillRect/>
+                    </a:stretch>
+                  </pic:blipFill>
+                  <pic:spPr>
+                    <a:xfrm>
+                      <a:off x="0" y="0"/>
+                      <a:ext cx="6120130" cy="3979545"/>
+                    </a:xfrm>
+                    <a:prstGeom prst="rect">
+                      <a:avLst/>
+                    </a:prstGeom>
+                  </pic:spPr>
+                </pic:pic>
+              </a:graphicData>
+            </a:graphic>
+          </wp:inline>
+        </w:drawing>
+      </w:r>
+    </w:p>
+    <w:p>
+      <w:pPr>
+        <w:jc w:val="center"/>
+        <w:rPr>
+          <w:rFonts w:eastAsiaTheme="minorEastAsia"/>
+        </w:rPr>
+      </w:pPr>
+      <w:r>
+        <w:rPr>
+          <w:rFonts w:eastAsiaTheme="minorEastAsia"/>
+        </w:rPr>
+        <w:t>Fig.17 (p = 30%)</w:t>
+      </w:r>
+    </w:p>
+    <w:p>
+      <w:pPr>
+        <w:rPr>
+          <w:rFonts w:eastAsiaTheme="minorEastAsia"/>
+        </w:rPr>
+      </w:pPr>
+      <w:r>
+        <w:rPr>
+          <w:noProof/>
+        </w:rPr>
+        <w:drawing>
+          <wp:inline distT="0" distB="0" distL="0" distR="0" wp14:anchorId="08836368" wp14:editId="5324D7E1">
+            <wp:extent cx="6120130" cy="3979545"/>
+            <wp:effectExtent l="0" t="0" r="0" b="1905"/>
+            <wp:docPr id="700592080" name="Immagine 1" descr="Immagine che contiene testo, Diagramma, diagramma, linea&#10;&#10;Il contenuto generato dall'IA potrebbe non essere corretto."/>
+            <wp:cNvGraphicFramePr>
+              <a:graphicFrameLocks xmlns:a="http://schemas.openxmlformats.org/drawingml/2006/main" noChangeAspect="1"/>
+            </wp:cNvGraphicFramePr>
+            <a:graphic xmlns:a="http://schemas.openxmlformats.org/drawingml/2006/main">
+              <a:graphicData uri="http://schemas.openxmlformats.org/drawingml/2006/picture">
+                <pic:pic xmlns:pic="http://schemas.openxmlformats.org/drawingml/2006/picture">
+                  <pic:nvPicPr>
+                    <pic:cNvPr id="700592080" name="Immagine 1" descr="Immagine che contiene testo, Diagramma, diagramma, linea&#10;&#10;Il contenuto generato dall'IA potrebbe non essere corretto."/>
+                    <pic:cNvPicPr/>
+                  </pic:nvPicPr>
+                  <pic:blipFill>
+                    <a:blip r:embed="rId27"/>
+                    <a:stretch>
+                      <a:fillRect/>
+                    </a:stretch>
+                  </pic:blipFill>
+                  <pic:spPr>
+                    <a:xfrm>
+                      <a:off x="0" y="0"/>
+                      <a:ext cx="6120130" cy="3979545"/>
+                    </a:xfrm>
+                    <a:prstGeom prst="rect">
+                      <a:avLst/>
+                    </a:prstGeom>
+                  </pic:spPr>
+                </pic:pic>
+              </a:graphicData>
+            </a:graphic>
+          </wp:inline>
+        </w:drawing>
+      </w:r>
     </w:p>
     <w:p>
       <w:pPr>
@@ -5846,6 +5964,7 @@
           <w:sz w:val="28"/>
           <w:szCs w:val="28"/>
         </w:rPr>
+        <w:lastRenderedPageBreak/>
         <w:t>IMPLEMENTAZIONE SU PENDOLO REALE</w:t>
       </w:r>
     </w:p>
@@ -7126,7 +7245,6 @@
   <w:style w:type="character" w:default="1" w:styleId="Carpredefinitoparagrafo">
     <w:name w:val="Default Paragraph Font"/>
     <w:uiPriority w:val="1"/>
-    <w:semiHidden/>
     <w:unhideWhenUsed/>
   </w:style>
   <w:style w:type="table" w:default="1" w:styleId="Tabellanormale">

</xml_diff>